<commit_message>
Actualiza matriz de planes SaaS del directorio
</commit_message>
<xml_diff>
--- a/outputs/Plan_SaaS_Directorio_Nexo_Klar/Propuesta_Planes_SaaS_Nexo_Klar_Directorio.docx
+++ b/outputs/Plan_SaaS_Directorio_Nexo_Klar/Propuesta_Planes_SaaS_Nexo_Klar_Directorio.docx
@@ -2788,6 +2788,828 @@
           </w:p>
         </w:tc>
       </w:tr>
+      <w:tr>
+        <w:tc>
+          <w:tcPr>
+            <w:tcW w:type="dxa" w:w="3300"/>
+            <w:tcBorders>
+              <w:top w:val="single" w:color="CBD5E1" w:sz="1"/>
+              <w:left w:val="single" w:color="CBD5E1" w:sz="1"/>
+              <w:bottom w:val="single" w:color="CBD5E1" w:sz="1"/>
+              <w:right w:val="single" w:color="CBD5E1" w:sz="1"/>
+            </w:tcBorders>
+            <w:shd w:fill="FFFFFF" w:val="clear"/>
+            <w:tcMar>
+              <w:top w:type="dxa" w:w="90"/>
+              <w:left w:type="dxa" w:w="110"/>
+              <w:bottom w:type="dxa" w:w="90"/>
+              <w:right w:type="dxa" w:w="110"/>
+            </w:tcMar>
+            <w:vAlign w:val="center"/>
+          </w:tcPr>
+          <w:p>
+            <w:r>
+              <w:rPr>
+                <w:rFonts w:ascii="Arial" w:hAnsi="Arial"/>
+              </w:rPr>
+              <w:t>Prospectos y oportunidades</w:t>
+            </w:r>
+          </w:p>
+        </w:tc>
+        <w:tc>
+          <w:tcPr>
+            <w:tcW w:type="dxa" w:w="1400"/>
+            <w:tcBorders>
+              <w:top w:val="single" w:color="CBD5E1" w:sz="1"/>
+              <w:left w:val="single" w:color="CBD5E1" w:sz="1"/>
+              <w:bottom w:val="single" w:color="CBD5E1" w:sz="1"/>
+              <w:right w:val="single" w:color="CBD5E1" w:sz="1"/>
+            </w:tcBorders>
+            <w:shd w:fill="FFFFFF" w:val="clear"/>
+            <w:tcMar>
+              <w:top w:type="dxa" w:w="90"/>
+              <w:left w:type="dxa" w:w="110"/>
+              <w:bottom w:type="dxa" w:w="90"/>
+              <w:right w:type="dxa" w:w="110"/>
+            </w:tcMar>
+            <w:vAlign w:val="center"/>
+          </w:tcPr>
+          <w:p>
+            <w:r>
+              <w:rPr>
+                <w:rFonts w:ascii="Arial" w:hAnsi="Arial"/>
+              </w:rPr>
+              <w:t>—</w:t>
+            </w:r>
+          </w:p>
+        </w:tc>
+        <w:tc>
+          <w:tcPr>
+            <w:tcW w:type="dxa" w:w="1400"/>
+            <w:tcBorders>
+              <w:top w:val="single" w:color="CBD5E1" w:sz="1"/>
+              <w:left w:val="single" w:color="CBD5E1" w:sz="1"/>
+              <w:bottom w:val="single" w:color="CBD5E1" w:sz="1"/>
+              <w:right w:val="single" w:color="CBD5E1" w:sz="1"/>
+            </w:tcBorders>
+            <w:shd w:fill="FFFFFF" w:val="clear"/>
+            <w:tcMar>
+              <w:top w:type="dxa" w:w="90"/>
+              <w:left w:type="dxa" w:w="110"/>
+              <w:bottom w:type="dxa" w:w="90"/>
+              <w:right w:type="dxa" w:w="110"/>
+            </w:tcMar>
+            <w:vAlign w:val="center"/>
+          </w:tcPr>
+          <w:p>
+            <w:r>
+              <w:rPr>
+                <w:rFonts w:ascii="Arial" w:hAnsi="Arial"/>
+              </w:rPr>
+              <w:t>Sí</w:t>
+            </w:r>
+          </w:p>
+        </w:tc>
+        <w:tc>
+          <w:tcPr>
+            <w:tcW w:type="dxa" w:w="1400"/>
+            <w:tcBorders>
+              <w:top w:val="single" w:color="CBD5E1" w:sz="1"/>
+              <w:left w:val="single" w:color="CBD5E1" w:sz="1"/>
+              <w:bottom w:val="single" w:color="CBD5E1" w:sz="1"/>
+              <w:right w:val="single" w:color="CBD5E1" w:sz="1"/>
+            </w:tcBorders>
+            <w:shd w:fill="FFFFFF" w:val="clear"/>
+            <w:tcMar>
+              <w:top w:type="dxa" w:w="90"/>
+              <w:left w:type="dxa" w:w="110"/>
+              <w:bottom w:type="dxa" w:w="90"/>
+              <w:right w:type="dxa" w:w="110"/>
+            </w:tcMar>
+            <w:vAlign w:val="center"/>
+          </w:tcPr>
+          <w:p>
+            <w:r>
+              <w:rPr>
+                <w:rFonts w:ascii="Arial" w:hAnsi="Arial"/>
+              </w:rPr>
+              <w:t>Sí</w:t>
+            </w:r>
+          </w:p>
+        </w:tc>
+        <w:tc>
+          <w:tcPr>
+            <w:tcW w:type="dxa" w:w="2246"/>
+            <w:tcBorders>
+              <w:top w:val="single" w:color="CBD5E1" w:sz="1"/>
+              <w:left w:val="single" w:color="CBD5E1" w:sz="1"/>
+              <w:bottom w:val="single" w:color="CBD5E1" w:sz="1"/>
+              <w:right w:val="single" w:color="CBD5E1" w:sz="1"/>
+            </w:tcBorders>
+            <w:shd w:fill="FFFFFF" w:val="clear"/>
+            <w:tcMar>
+              <w:top w:type="dxa" w:w="90"/>
+              <w:left w:type="dxa" w:w="110"/>
+              <w:bottom w:type="dxa" w:w="90"/>
+              <w:right w:type="dxa" w:w="110"/>
+            </w:tcMar>
+            <w:vAlign w:val="center"/>
+          </w:tcPr>
+          <w:p>
+            <w:r>
+              <w:rPr>
+                <w:rFonts w:ascii="Arial" w:hAnsi="Arial"/>
+              </w:rPr>
+              <w:t>Avanzado</w:t>
+            </w:r>
+          </w:p>
+        </w:tc>
+      </w:tr>
+      <w:tr>
+        <w:tc>
+          <w:tcPr>
+            <w:tcW w:type="dxa" w:w="3300"/>
+            <w:tcBorders>
+              <w:top w:val="single" w:color="CBD5E1" w:sz="1"/>
+              <w:left w:val="single" w:color="CBD5E1" w:sz="1"/>
+              <w:bottom w:val="single" w:color="CBD5E1" w:sz="1"/>
+              <w:right w:val="single" w:color="CBD5E1" w:sz="1"/>
+            </w:tcBorders>
+            <w:shd w:fill="FFFFFF" w:val="clear"/>
+            <w:tcMar>
+              <w:top w:type="dxa" w:w="90"/>
+              <w:left w:type="dxa" w:w="110"/>
+              <w:bottom w:type="dxa" w:w="90"/>
+              <w:right w:type="dxa" w:w="110"/>
+            </w:tcMar>
+            <w:vAlign w:val="center"/>
+          </w:tcPr>
+          <w:p>
+            <w:r>
+              <w:rPr>
+                <w:rFonts w:ascii="Arial" w:hAnsi="Arial"/>
+              </w:rPr>
+              <w:t>Cliente 360</w:t>
+            </w:r>
+          </w:p>
+        </w:tc>
+        <w:tc>
+          <w:tcPr>
+            <w:tcW w:type="dxa" w:w="1400"/>
+            <w:tcBorders>
+              <w:top w:val="single" w:color="CBD5E1" w:sz="1"/>
+              <w:left w:val="single" w:color="CBD5E1" w:sz="1"/>
+              <w:bottom w:val="single" w:color="CBD5E1" w:sz="1"/>
+              <w:right w:val="single" w:color="CBD5E1" w:sz="1"/>
+            </w:tcBorders>
+            <w:shd w:fill="FFFFFF" w:val="clear"/>
+            <w:tcMar>
+              <w:top w:type="dxa" w:w="90"/>
+              <w:left w:type="dxa" w:w="110"/>
+              <w:bottom w:type="dxa" w:w="90"/>
+              <w:right w:type="dxa" w:w="110"/>
+            </w:tcMar>
+            <w:vAlign w:val="center"/>
+          </w:tcPr>
+          <w:p>
+            <w:r>
+              <w:rPr>
+                <w:rFonts w:ascii="Arial" w:hAnsi="Arial"/>
+              </w:rPr>
+              <w:t>—</w:t>
+            </w:r>
+          </w:p>
+        </w:tc>
+        <w:tc>
+          <w:tcPr>
+            <w:tcW w:type="dxa" w:w="1400"/>
+            <w:tcBorders>
+              <w:top w:val="single" w:color="CBD5E1" w:sz="1"/>
+              <w:left w:val="single" w:color="CBD5E1" w:sz="1"/>
+              <w:bottom w:val="single" w:color="CBD5E1" w:sz="1"/>
+              <w:right w:val="single" w:color="CBD5E1" w:sz="1"/>
+            </w:tcBorders>
+            <w:shd w:fill="FFFFFF" w:val="clear"/>
+            <w:tcMar>
+              <w:top w:type="dxa" w:w="90"/>
+              <w:left w:type="dxa" w:w="110"/>
+              <w:bottom w:type="dxa" w:w="90"/>
+              <w:right w:type="dxa" w:w="110"/>
+            </w:tcMar>
+            <w:vAlign w:val="center"/>
+          </w:tcPr>
+          <w:p>
+            <w:r>
+              <w:rPr>
+                <w:rFonts w:ascii="Arial" w:hAnsi="Arial"/>
+              </w:rPr>
+              <w:t>Sí</w:t>
+            </w:r>
+          </w:p>
+        </w:tc>
+        <w:tc>
+          <w:tcPr>
+            <w:tcW w:type="dxa" w:w="1400"/>
+            <w:tcBorders>
+              <w:top w:val="single" w:color="CBD5E1" w:sz="1"/>
+              <w:left w:val="single" w:color="CBD5E1" w:sz="1"/>
+              <w:bottom w:val="single" w:color="CBD5E1" w:sz="1"/>
+              <w:right w:val="single" w:color="CBD5E1" w:sz="1"/>
+            </w:tcBorders>
+            <w:shd w:fill="FFFFFF" w:val="clear"/>
+            <w:tcMar>
+              <w:top w:type="dxa" w:w="90"/>
+              <w:left w:type="dxa" w:w="110"/>
+              <w:bottom w:type="dxa" w:w="90"/>
+              <w:right w:type="dxa" w:w="110"/>
+            </w:tcMar>
+            <w:vAlign w:val="center"/>
+          </w:tcPr>
+          <w:p>
+            <w:r>
+              <w:rPr>
+                <w:rFonts w:ascii="Arial" w:hAnsi="Arial"/>
+              </w:rPr>
+              <w:t>Sí</w:t>
+            </w:r>
+          </w:p>
+        </w:tc>
+        <w:tc>
+          <w:tcPr>
+            <w:tcW w:type="dxa" w:w="2246"/>
+            <w:tcBorders>
+              <w:top w:val="single" w:color="CBD5E1" w:sz="1"/>
+              <w:left w:val="single" w:color="CBD5E1" w:sz="1"/>
+              <w:bottom w:val="single" w:color="CBD5E1" w:sz="1"/>
+              <w:right w:val="single" w:color="CBD5E1" w:sz="1"/>
+            </w:tcBorders>
+            <w:shd w:fill="FFFFFF" w:val="clear"/>
+            <w:tcMar>
+              <w:top w:type="dxa" w:w="90"/>
+              <w:left w:type="dxa" w:w="110"/>
+              <w:bottom w:type="dxa" w:w="90"/>
+              <w:right w:type="dxa" w:w="110"/>
+            </w:tcMar>
+            <w:vAlign w:val="center"/>
+          </w:tcPr>
+          <w:p>
+            <w:r>
+              <w:rPr>
+                <w:rFonts w:ascii="Arial" w:hAnsi="Arial"/>
+              </w:rPr>
+              <w:t>Avanzado</w:t>
+            </w:r>
+          </w:p>
+        </w:tc>
+      </w:tr>
+      <w:tr>
+        <w:tc>
+          <w:tcPr>
+            <w:tcW w:type="dxa" w:w="3300"/>
+            <w:tcBorders>
+              <w:top w:val="single" w:color="CBD5E1" w:sz="1"/>
+              <w:left w:val="single" w:color="CBD5E1" w:sz="1"/>
+              <w:bottom w:val="single" w:color="CBD5E1" w:sz="1"/>
+              <w:right w:val="single" w:color="CBD5E1" w:sz="1"/>
+            </w:tcBorders>
+            <w:shd w:fill="FFFFFF" w:val="clear"/>
+            <w:tcMar>
+              <w:top w:type="dxa" w:w="90"/>
+              <w:left w:type="dxa" w:w="110"/>
+              <w:bottom w:type="dxa" w:w="90"/>
+              <w:right w:type="dxa" w:w="110"/>
+            </w:tcMar>
+            <w:vAlign w:val="center"/>
+          </w:tcPr>
+          <w:p>
+            <w:r>
+              <w:rPr>
+                <w:rFonts w:ascii="Arial" w:hAnsi="Arial"/>
+              </w:rPr>
+              <w:t>Habilitación y auditoría documental</w:t>
+            </w:r>
+          </w:p>
+        </w:tc>
+        <w:tc>
+          <w:tcPr>
+            <w:tcW w:type="dxa" w:w="1400"/>
+            <w:tcBorders>
+              <w:top w:val="single" w:color="CBD5E1" w:sz="1"/>
+              <w:left w:val="single" w:color="CBD5E1" w:sz="1"/>
+              <w:bottom w:val="single" w:color="CBD5E1" w:sz="1"/>
+              <w:right w:val="single" w:color="CBD5E1" w:sz="1"/>
+            </w:tcBorders>
+            <w:shd w:fill="FFFFFF" w:val="clear"/>
+            <w:tcMar>
+              <w:top w:type="dxa" w:w="90"/>
+              <w:left w:type="dxa" w:w="110"/>
+              <w:bottom w:type="dxa" w:w="90"/>
+              <w:right w:type="dxa" w:w="110"/>
+            </w:tcMar>
+            <w:vAlign w:val="center"/>
+          </w:tcPr>
+          <w:p>
+            <w:r>
+              <w:rPr>
+                <w:rFonts w:ascii="Arial" w:hAnsi="Arial"/>
+              </w:rPr>
+              <w:t>—</w:t>
+            </w:r>
+          </w:p>
+        </w:tc>
+        <w:tc>
+          <w:tcPr>
+            <w:tcW w:type="dxa" w:w="1400"/>
+            <w:tcBorders>
+              <w:top w:val="single" w:color="CBD5E1" w:sz="1"/>
+              <w:left w:val="single" w:color="CBD5E1" w:sz="1"/>
+              <w:bottom w:val="single" w:color="CBD5E1" w:sz="1"/>
+              <w:right w:val="single" w:color="CBD5E1" w:sz="1"/>
+            </w:tcBorders>
+            <w:shd w:fill="FFFFFF" w:val="clear"/>
+            <w:tcMar>
+              <w:top w:type="dxa" w:w="90"/>
+              <w:left w:type="dxa" w:w="110"/>
+              <w:bottom w:type="dxa" w:w="90"/>
+              <w:right w:type="dxa" w:w="110"/>
+            </w:tcMar>
+            <w:vAlign w:val="center"/>
+          </w:tcPr>
+          <w:p>
+            <w:r>
+              <w:rPr>
+                <w:rFonts w:ascii="Arial" w:hAnsi="Arial"/>
+              </w:rPr>
+              <w:t>Sí</w:t>
+            </w:r>
+          </w:p>
+        </w:tc>
+        <w:tc>
+          <w:tcPr>
+            <w:tcW w:type="dxa" w:w="1400"/>
+            <w:tcBorders>
+              <w:top w:val="single" w:color="CBD5E1" w:sz="1"/>
+              <w:left w:val="single" w:color="CBD5E1" w:sz="1"/>
+              <w:bottom w:val="single" w:color="CBD5E1" w:sz="1"/>
+              <w:right w:val="single" w:color="CBD5E1" w:sz="1"/>
+            </w:tcBorders>
+            <w:shd w:fill="FFFFFF" w:val="clear"/>
+            <w:tcMar>
+              <w:top w:type="dxa" w:w="90"/>
+              <w:left w:type="dxa" w:w="110"/>
+              <w:bottom w:type="dxa" w:w="90"/>
+              <w:right w:type="dxa" w:w="110"/>
+            </w:tcMar>
+            <w:vAlign w:val="center"/>
+          </w:tcPr>
+          <w:p>
+            <w:r>
+              <w:rPr>
+                <w:rFonts w:ascii="Arial" w:hAnsi="Arial"/>
+              </w:rPr>
+              <w:t>Sí</w:t>
+            </w:r>
+          </w:p>
+        </w:tc>
+        <w:tc>
+          <w:tcPr>
+            <w:tcW w:type="dxa" w:w="2246"/>
+            <w:tcBorders>
+              <w:top w:val="single" w:color="CBD5E1" w:sz="1"/>
+              <w:left w:val="single" w:color="CBD5E1" w:sz="1"/>
+              <w:bottom w:val="single" w:color="CBD5E1" w:sz="1"/>
+              <w:right w:val="single" w:color="CBD5E1" w:sz="1"/>
+            </w:tcBorders>
+            <w:shd w:fill="FFFFFF" w:val="clear"/>
+            <w:tcMar>
+              <w:top w:type="dxa" w:w="90"/>
+              <w:left w:type="dxa" w:w="110"/>
+              <w:bottom w:type="dxa" w:w="90"/>
+              <w:right w:type="dxa" w:w="110"/>
+            </w:tcMar>
+            <w:vAlign w:val="center"/>
+          </w:tcPr>
+          <w:p>
+            <w:r>
+              <w:rPr>
+                <w:rFonts w:ascii="Arial" w:hAnsi="Arial"/>
+              </w:rPr>
+              <w:t>Inteligente</w:t>
+            </w:r>
+          </w:p>
+        </w:tc>
+      </w:tr>
+      <w:tr>
+        <w:tc>
+          <w:tcPr>
+            <w:tcW w:type="dxa" w:w="3300"/>
+            <w:tcBorders>
+              <w:top w:val="single" w:color="CBD5E1" w:sz="1"/>
+              <w:left w:val="single" w:color="CBD5E1" w:sz="1"/>
+              <w:bottom w:val="single" w:color="CBD5E1" w:sz="1"/>
+              <w:right w:val="single" w:color="CBD5E1" w:sz="1"/>
+            </w:tcBorders>
+            <w:shd w:fill="FFFFFF" w:val="clear"/>
+            <w:tcMar>
+              <w:top w:type="dxa" w:w="90"/>
+              <w:left w:type="dxa" w:w="110"/>
+              <w:bottom w:type="dxa" w:w="90"/>
+              <w:right w:type="dxa" w:w="110"/>
+            </w:tcMar>
+            <w:vAlign w:val="center"/>
+          </w:tcPr>
+          <w:p>
+            <w:r>
+              <w:rPr>
+                <w:rFonts w:ascii="Arial" w:hAnsi="Arial"/>
+              </w:rPr>
+              <w:t>Incidentes y acciones correctivas</w:t>
+            </w:r>
+          </w:p>
+        </w:tc>
+        <w:tc>
+          <w:tcPr>
+            <w:tcW w:type="dxa" w:w="1400"/>
+            <w:tcBorders>
+              <w:top w:val="single" w:color="CBD5E1" w:sz="1"/>
+              <w:left w:val="single" w:color="CBD5E1" w:sz="1"/>
+              <w:bottom w:val="single" w:color="CBD5E1" w:sz="1"/>
+              <w:right w:val="single" w:color="CBD5E1" w:sz="1"/>
+            </w:tcBorders>
+            <w:shd w:fill="FFFFFF" w:val="clear"/>
+            <w:tcMar>
+              <w:top w:type="dxa" w:w="90"/>
+              <w:left w:type="dxa" w:w="110"/>
+              <w:bottom w:type="dxa" w:w="90"/>
+              <w:right w:type="dxa" w:w="110"/>
+            </w:tcMar>
+            <w:vAlign w:val="center"/>
+          </w:tcPr>
+          <w:p>
+            <w:r>
+              <w:rPr>
+                <w:rFonts w:ascii="Arial" w:hAnsi="Arial"/>
+              </w:rPr>
+              <w:t>—</w:t>
+            </w:r>
+          </w:p>
+        </w:tc>
+        <w:tc>
+          <w:tcPr>
+            <w:tcW w:type="dxa" w:w="1400"/>
+            <w:tcBorders>
+              <w:top w:val="single" w:color="CBD5E1" w:sz="1"/>
+              <w:left w:val="single" w:color="CBD5E1" w:sz="1"/>
+              <w:bottom w:val="single" w:color="CBD5E1" w:sz="1"/>
+              <w:right w:val="single" w:color="CBD5E1" w:sz="1"/>
+            </w:tcBorders>
+            <w:shd w:fill="FFFFFF" w:val="clear"/>
+            <w:tcMar>
+              <w:top w:type="dxa" w:w="90"/>
+              <w:left w:type="dxa" w:w="110"/>
+              <w:bottom w:type="dxa" w:w="90"/>
+              <w:right w:type="dxa" w:w="110"/>
+            </w:tcMar>
+            <w:vAlign w:val="center"/>
+          </w:tcPr>
+          <w:p>
+            <w:r>
+              <w:rPr>
+                <w:rFonts w:ascii="Arial" w:hAnsi="Arial"/>
+              </w:rPr>
+              <w:t>—</w:t>
+            </w:r>
+          </w:p>
+        </w:tc>
+        <w:tc>
+          <w:tcPr>
+            <w:tcW w:type="dxa" w:w="1400"/>
+            <w:tcBorders>
+              <w:top w:val="single" w:color="CBD5E1" w:sz="1"/>
+              <w:left w:val="single" w:color="CBD5E1" w:sz="1"/>
+              <w:bottom w:val="single" w:color="CBD5E1" w:sz="1"/>
+              <w:right w:val="single" w:color="CBD5E1" w:sz="1"/>
+            </w:tcBorders>
+            <w:shd w:fill="FFFFFF" w:val="clear"/>
+            <w:tcMar>
+              <w:top w:type="dxa" w:w="90"/>
+              <w:left w:type="dxa" w:w="110"/>
+              <w:bottom w:type="dxa" w:w="90"/>
+              <w:right w:type="dxa" w:w="110"/>
+            </w:tcMar>
+            <w:vAlign w:val="center"/>
+          </w:tcPr>
+          <w:p>
+            <w:r>
+              <w:rPr>
+                <w:rFonts w:ascii="Arial" w:hAnsi="Arial"/>
+              </w:rPr>
+              <w:t>Sí</w:t>
+            </w:r>
+          </w:p>
+        </w:tc>
+        <w:tc>
+          <w:tcPr>
+            <w:tcW w:type="dxa" w:w="2246"/>
+            <w:tcBorders>
+              <w:top w:val="single" w:color="CBD5E1" w:sz="1"/>
+              <w:left w:val="single" w:color="CBD5E1" w:sz="1"/>
+              <w:bottom w:val="single" w:color="CBD5E1" w:sz="1"/>
+              <w:right w:val="single" w:color="CBD5E1" w:sz="1"/>
+            </w:tcBorders>
+            <w:shd w:fill="FFFFFF" w:val="clear"/>
+            <w:tcMar>
+              <w:top w:type="dxa" w:w="90"/>
+              <w:left w:type="dxa" w:w="110"/>
+              <w:bottom w:type="dxa" w:w="90"/>
+              <w:right w:type="dxa" w:w="110"/>
+            </w:tcMar>
+            <w:vAlign w:val="center"/>
+          </w:tcPr>
+          <w:p>
+            <w:r>
+              <w:rPr>
+                <w:rFonts w:ascii="Arial" w:hAnsi="Arial"/>
+              </w:rPr>
+              <w:t>Sí</w:t>
+            </w:r>
+          </w:p>
+        </w:tc>
+      </w:tr>
+      <w:tr>
+        <w:tc>
+          <w:tcPr>
+            <w:tcW w:type="dxa" w:w="3300"/>
+            <w:tcBorders>
+              <w:top w:val="single" w:color="CBD5E1" w:sz="1"/>
+              <w:left w:val="single" w:color="CBD5E1" w:sz="1"/>
+              <w:bottom w:val="single" w:color="CBD5E1" w:sz="1"/>
+              <w:right w:val="single" w:color="CBD5E1" w:sz="1"/>
+            </w:tcBorders>
+            <w:shd w:fill="FFFFFF" w:val="clear"/>
+            <w:tcMar>
+              <w:top w:type="dxa" w:w="90"/>
+              <w:left w:type="dxa" w:w="110"/>
+              <w:bottom w:type="dxa" w:w="90"/>
+              <w:right w:type="dxa" w:w="110"/>
+            </w:tcMar>
+            <w:vAlign w:val="center"/>
+          </w:tcPr>
+          <w:p>
+            <w:r>
+              <w:rPr>
+                <w:rFonts w:ascii="Arial" w:hAnsi="Arial"/>
+              </w:rPr>
+              <w:t>Costos y rentabilidad</w:t>
+            </w:r>
+          </w:p>
+        </w:tc>
+        <w:tc>
+          <w:tcPr>
+            <w:tcW w:type="dxa" w:w="1400"/>
+            <w:tcBorders>
+              <w:top w:val="single" w:color="CBD5E1" w:sz="1"/>
+              <w:left w:val="single" w:color="CBD5E1" w:sz="1"/>
+              <w:bottom w:val="single" w:color="CBD5E1" w:sz="1"/>
+              <w:right w:val="single" w:color="CBD5E1" w:sz="1"/>
+            </w:tcBorders>
+            <w:shd w:fill="FFFFFF" w:val="clear"/>
+            <w:tcMar>
+              <w:top w:type="dxa" w:w="90"/>
+              <w:left w:type="dxa" w:w="110"/>
+              <w:bottom w:type="dxa" w:w="90"/>
+              <w:right w:type="dxa" w:w="110"/>
+            </w:tcMar>
+            <w:vAlign w:val="center"/>
+          </w:tcPr>
+          <w:p>
+            <w:r>
+              <w:rPr>
+                <w:rFonts w:ascii="Arial" w:hAnsi="Arial"/>
+              </w:rPr>
+              <w:t>—</w:t>
+            </w:r>
+          </w:p>
+        </w:tc>
+        <w:tc>
+          <w:tcPr>
+            <w:tcW w:type="dxa" w:w="1400"/>
+            <w:tcBorders>
+              <w:top w:val="single" w:color="CBD5E1" w:sz="1"/>
+              <w:left w:val="single" w:color="CBD5E1" w:sz="1"/>
+              <w:bottom w:val="single" w:color="CBD5E1" w:sz="1"/>
+              <w:right w:val="single" w:color="CBD5E1" w:sz="1"/>
+            </w:tcBorders>
+            <w:shd w:fill="FFFFFF" w:val="clear"/>
+            <w:tcMar>
+              <w:top w:type="dxa" w:w="90"/>
+              <w:left w:type="dxa" w:w="110"/>
+              <w:bottom w:type="dxa" w:w="90"/>
+              <w:right w:type="dxa" w:w="110"/>
+            </w:tcMar>
+            <w:vAlign w:val="center"/>
+          </w:tcPr>
+          <w:p>
+            <w:r>
+              <w:rPr>
+                <w:rFonts w:ascii="Arial" w:hAnsi="Arial"/>
+              </w:rPr>
+              <w:t>—</w:t>
+            </w:r>
+          </w:p>
+        </w:tc>
+        <w:tc>
+          <w:tcPr>
+            <w:tcW w:type="dxa" w:w="1400"/>
+            <w:tcBorders>
+              <w:top w:val="single" w:color="CBD5E1" w:sz="1"/>
+              <w:left w:val="single" w:color="CBD5E1" w:sz="1"/>
+              <w:bottom w:val="single" w:color="CBD5E1" w:sz="1"/>
+              <w:right w:val="single" w:color="CBD5E1" w:sz="1"/>
+            </w:tcBorders>
+            <w:shd w:fill="FFFFFF" w:val="clear"/>
+            <w:tcMar>
+              <w:top w:type="dxa" w:w="90"/>
+              <w:left w:type="dxa" w:w="110"/>
+              <w:bottom w:type="dxa" w:w="90"/>
+              <w:right w:type="dxa" w:w="110"/>
+            </w:tcMar>
+            <w:vAlign w:val="center"/>
+          </w:tcPr>
+          <w:p>
+            <w:r>
+              <w:rPr>
+                <w:rFonts w:ascii="Arial" w:hAnsi="Arial"/>
+              </w:rPr>
+              <w:t>Sí</w:t>
+            </w:r>
+          </w:p>
+        </w:tc>
+        <w:tc>
+          <w:tcPr>
+            <w:tcW w:type="dxa" w:w="2246"/>
+            <w:tcBorders>
+              <w:top w:val="single" w:color="CBD5E1" w:sz="1"/>
+              <w:left w:val="single" w:color="CBD5E1" w:sz="1"/>
+              <w:bottom w:val="single" w:color="CBD5E1" w:sz="1"/>
+              <w:right w:val="single" w:color="CBD5E1" w:sz="1"/>
+            </w:tcBorders>
+            <w:shd w:fill="FFFFFF" w:val="clear"/>
+            <w:tcMar>
+              <w:top w:type="dxa" w:w="90"/>
+              <w:left w:type="dxa" w:w="110"/>
+              <w:bottom w:type="dxa" w:w="90"/>
+              <w:right w:type="dxa" w:w="110"/>
+            </w:tcMar>
+            <w:vAlign w:val="center"/>
+          </w:tcPr>
+          <w:p>
+            <w:r>
+              <w:rPr>
+                <w:rFonts w:ascii="Arial" w:hAnsi="Arial"/>
+              </w:rPr>
+              <w:t>Avanzado</w:t>
+            </w:r>
+          </w:p>
+        </w:tc>
+      </w:tr>
+      <w:tr>
+        <w:tc>
+          <w:tcPr>
+            <w:tcW w:type="dxa" w:w="3300"/>
+            <w:tcBorders>
+              <w:top w:val="single" w:color="CBD5E1" w:sz="1"/>
+              <w:left w:val="single" w:color="CBD5E1" w:sz="1"/>
+              <w:bottom w:val="single" w:color="CBD5E1" w:sz="1"/>
+              <w:right w:val="single" w:color="CBD5E1" w:sz="1"/>
+            </w:tcBorders>
+            <w:shd w:fill="FFFFFF" w:val="clear"/>
+            <w:tcMar>
+              <w:top w:type="dxa" w:w="90"/>
+              <w:left w:type="dxa" w:w="110"/>
+              <w:bottom w:type="dxa" w:w="90"/>
+              <w:right w:type="dxa" w:w="110"/>
+            </w:tcMar>
+            <w:vAlign w:val="center"/>
+          </w:tcPr>
+          <w:p>
+            <w:r>
+              <w:rPr>
+                <w:rFonts w:ascii="Arial" w:hAnsi="Arial"/>
+              </w:rPr>
+              <w:t>Gobernanza y separación de datos</w:t>
+            </w:r>
+          </w:p>
+        </w:tc>
+        <w:tc>
+          <w:tcPr>
+            <w:tcW w:type="dxa" w:w="1400"/>
+            <w:tcBorders>
+              <w:top w:val="single" w:color="CBD5E1" w:sz="1"/>
+              <w:left w:val="single" w:color="CBD5E1" w:sz="1"/>
+              <w:bottom w:val="single" w:color="CBD5E1" w:sz="1"/>
+              <w:right w:val="single" w:color="CBD5E1" w:sz="1"/>
+            </w:tcBorders>
+            <w:shd w:fill="FFFFFF" w:val="clear"/>
+            <w:tcMar>
+              <w:top w:type="dxa" w:w="90"/>
+              <w:left w:type="dxa" w:w="110"/>
+              <w:bottom w:type="dxa" w:w="90"/>
+              <w:right w:type="dxa" w:w="110"/>
+            </w:tcMar>
+            <w:vAlign w:val="center"/>
+          </w:tcPr>
+          <w:p>
+            <w:r>
+              <w:rPr>
+                <w:rFonts w:ascii="Arial" w:hAnsi="Arial"/>
+              </w:rPr>
+              <w:t>Sí</w:t>
+            </w:r>
+          </w:p>
+        </w:tc>
+        <w:tc>
+          <w:tcPr>
+            <w:tcW w:type="dxa" w:w="1400"/>
+            <w:tcBorders>
+              <w:top w:val="single" w:color="CBD5E1" w:sz="1"/>
+              <w:left w:val="single" w:color="CBD5E1" w:sz="1"/>
+              <w:bottom w:val="single" w:color="CBD5E1" w:sz="1"/>
+              <w:right w:val="single" w:color="CBD5E1" w:sz="1"/>
+            </w:tcBorders>
+            <w:shd w:fill="FFFFFF" w:val="clear"/>
+            <w:tcMar>
+              <w:top w:type="dxa" w:w="90"/>
+              <w:left w:type="dxa" w:w="110"/>
+              <w:bottom w:type="dxa" w:w="90"/>
+              <w:right w:type="dxa" w:w="110"/>
+            </w:tcMar>
+            <w:vAlign w:val="center"/>
+          </w:tcPr>
+          <w:p>
+            <w:r>
+              <w:rPr>
+                <w:rFonts w:ascii="Arial" w:hAnsi="Arial"/>
+              </w:rPr>
+              <w:t>Sí</w:t>
+            </w:r>
+          </w:p>
+        </w:tc>
+        <w:tc>
+          <w:tcPr>
+            <w:tcW w:type="dxa" w:w="1400"/>
+            <w:tcBorders>
+              <w:top w:val="single" w:color="CBD5E1" w:sz="1"/>
+              <w:left w:val="single" w:color="CBD5E1" w:sz="1"/>
+              <w:bottom w:val="single" w:color="CBD5E1" w:sz="1"/>
+              <w:right w:val="single" w:color="CBD5E1" w:sz="1"/>
+            </w:tcBorders>
+            <w:shd w:fill="FFFFFF" w:val="clear"/>
+            <w:tcMar>
+              <w:top w:type="dxa" w:w="90"/>
+              <w:left w:type="dxa" w:w="110"/>
+              <w:bottom w:type="dxa" w:w="90"/>
+              <w:right w:type="dxa" w:w="110"/>
+            </w:tcMar>
+            <w:vAlign w:val="center"/>
+          </w:tcPr>
+          <w:p>
+            <w:r>
+              <w:rPr>
+                <w:rFonts w:ascii="Arial" w:hAnsi="Arial"/>
+              </w:rPr>
+              <w:t>Sí</w:t>
+            </w:r>
+          </w:p>
+        </w:tc>
+        <w:tc>
+          <w:tcPr>
+            <w:tcW w:type="dxa" w:w="2246"/>
+            <w:tcBorders>
+              <w:top w:val="single" w:color="CBD5E1" w:sz="1"/>
+              <w:left w:val="single" w:color="CBD5E1" w:sz="1"/>
+              <w:bottom w:val="single" w:color="CBD5E1" w:sz="1"/>
+              <w:right w:val="single" w:color="CBD5E1" w:sz="1"/>
+            </w:tcBorders>
+            <w:shd w:fill="FFFFFF" w:val="clear"/>
+            <w:tcMar>
+              <w:top w:type="dxa" w:w="90"/>
+              <w:left w:type="dxa" w:w="110"/>
+              <w:bottom w:type="dxa" w:w="90"/>
+              <w:right w:type="dxa" w:w="110"/>
+            </w:tcMar>
+            <w:vAlign w:val="center"/>
+          </w:tcPr>
+          <w:p>
+            <w:r>
+              <w:rPr>
+                <w:rFonts w:ascii="Arial" w:hAnsi="Arial"/>
+              </w:rPr>
+              <w:t>Avanzada</w:t>
+            </w:r>
+          </w:p>
+        </w:tc>
+      </w:tr>
     </w:tbl>
     <w:p>
       <w:pPr>
@@ -3101,6 +3923,25 @@
     </w:p>
     <w:p>
       <w:pPr>
+        <w:pStyle w:val="ListParagraph"/>
+        <w:numPr>
+          <w:ilvl w:val="0"/>
+          <w:numId w:val="3"/>
+        </w:numPr>
+        <w:spacing w:after="70" w:line="276"/>
+      </w:pPr>
+      <w:r>
+        <w:rPr>
+          <w:rFonts w:ascii="Arial" w:cs="Arial" w:eastAsia="Arial" w:hAnsi="Arial"/>
+          <w:color w:val="475569"/>
+          <w:sz w:val="20"/>
+          <w:szCs w:val="20"/>
+        </w:rPr>
+        <w:t>Gobernanza, separación y conservación de datos</w:t>
+      </w:r>
+    </w:p>
+    <w:p>
+      <w:pPr>
         <w:pStyle w:val="Heading2"/>
       </w:pPr>
       <w:r>
@@ -3304,7 +4145,7 @@
           <w:sz w:val="20"/>
           <w:szCs w:val="20"/>
         </w:rPr>
-        <w:t xml:space="preserve">Personal permanente y temporal</w:t>
+        <w:t>Prospectos y oportunidades</w:t>
       </w:r>
     </w:p>
     <w:p>
@@ -3323,7 +4164,7 @@
           <w:sz w:val="20"/>
           <w:szCs w:val="20"/>
         </w:rPr>
-        <w:t xml:space="preserve">EPP y entregas</w:t>
+        <w:t>Cliente 360</w:t>
       </w:r>
     </w:p>
     <w:p>
@@ -3342,7 +4183,7 @@
           <w:sz w:val="20"/>
           <w:szCs w:val="20"/>
         </w:rPr>
-        <w:t xml:space="preserve">Formación y certificaciones</w:t>
+        <w:t xml:space="preserve">Personal permanente y temporal</w:t>
       </w:r>
     </w:p>
     <w:p>
@@ -3361,7 +4202,7 @@
           <w:sz w:val="20"/>
           <w:szCs w:val="20"/>
         </w:rPr>
-        <w:t xml:space="preserve">Exámenes y aptitudes</w:t>
+        <w:t xml:space="preserve">EPP y entregas</w:t>
       </w:r>
     </w:p>
     <w:p>
@@ -3380,7 +4221,83 @@
           <w:sz w:val="20"/>
           <w:szCs w:val="20"/>
         </w:rPr>
+        <w:t xml:space="preserve">Formación y certificaciones</w:t>
+      </w:r>
+    </w:p>
+    <w:p>
+      <w:pPr>
+        <w:pStyle w:val="ListParagraph"/>
+        <w:numPr>
+          <w:ilvl w:val="0"/>
+          <w:numId w:val="4"/>
+        </w:numPr>
+        <w:spacing w:after="70" w:line="276"/>
+      </w:pPr>
+      <w:r>
+        <w:rPr>
+          <w:rFonts w:ascii="Arial" w:cs="Arial" w:eastAsia="Arial" w:hAnsi="Arial"/>
+          <w:color w:val="475569"/>
+          <w:sz w:val="20"/>
+          <w:szCs w:val="20"/>
+        </w:rPr>
+        <w:t xml:space="preserve">Exámenes y aptitudes</w:t>
+      </w:r>
+    </w:p>
+    <w:p>
+      <w:pPr>
+        <w:pStyle w:val="ListParagraph"/>
+        <w:numPr>
+          <w:ilvl w:val="0"/>
+          <w:numId w:val="4"/>
+        </w:numPr>
+        <w:spacing w:after="70" w:line="276"/>
+      </w:pPr>
+      <w:r>
+        <w:rPr>
+          <w:rFonts w:ascii="Arial" w:cs="Arial" w:eastAsia="Arial" w:hAnsi="Arial"/>
+          <w:color w:val="475569"/>
+          <w:sz w:val="20"/>
+          <w:szCs w:val="20"/>
+        </w:rPr>
         <w:t xml:space="preserve">Cumplimiento corporativo</w:t>
+      </w:r>
+    </w:p>
+    <w:p>
+      <w:pPr>
+        <w:pStyle w:val="ListParagraph"/>
+        <w:numPr>
+          <w:ilvl w:val="0"/>
+          <w:numId w:val="4"/>
+        </w:numPr>
+        <w:spacing w:after="70" w:line="276"/>
+      </w:pPr>
+      <w:r>
+        <w:rPr>
+          <w:rFonts w:ascii="Arial" w:cs="Arial" w:eastAsia="Arial" w:hAnsi="Arial"/>
+          <w:color w:val="475569"/>
+          <w:sz w:val="20"/>
+          <w:szCs w:val="20"/>
+        </w:rPr>
+        <w:t>Habilitación por cliente</w:t>
+      </w:r>
+    </w:p>
+    <w:p>
+      <w:pPr>
+        <w:pStyle w:val="ListParagraph"/>
+        <w:numPr>
+          <w:ilvl w:val="0"/>
+          <w:numId w:val="4"/>
+        </w:numPr>
+        <w:spacing w:after="70" w:line="276"/>
+      </w:pPr>
+      <w:r>
+        <w:rPr>
+          <w:rFonts w:ascii="Arial" w:cs="Arial" w:eastAsia="Arial" w:hAnsi="Arial"/>
+          <w:color w:val="475569"/>
+          <w:sz w:val="20"/>
+          <w:szCs w:val="20"/>
+        </w:rPr>
+        <w:t>Auditoría documental</w:t>
       </w:r>
     </w:p>
     <w:p>
@@ -3759,7 +4676,7 @@
           <w:sz w:val="20"/>
           <w:szCs w:val="20"/>
         </w:rPr>
-        <w:t xml:space="preserve">Incidentes y no conformidades</w:t>
+        <w:t>Incidentes y no conformidades con evidencia, investigación y cierre</w:t>
       </w:r>
     </w:p>
     <w:p>
@@ -3817,6 +4734,44 @@
           <w:szCs w:val="20"/>
         </w:rPr>
         <w:t xml:space="preserve">Acciones correctivas</w:t>
+      </w:r>
+    </w:p>
+    <w:p>
+      <w:pPr>
+        <w:pStyle w:val="ListParagraph"/>
+        <w:numPr>
+          <w:ilvl w:val="0"/>
+          <w:numId w:val="5"/>
+        </w:numPr>
+        <w:spacing w:after="70" w:line="276"/>
+      </w:pPr>
+      <w:r>
+        <w:rPr>
+          <w:rFonts w:ascii="Arial" w:cs="Arial" w:eastAsia="Arial" w:hAnsi="Arial"/>
+          <w:color w:val="475569"/>
+          <w:sz w:val="20"/>
+          <w:szCs w:val="20"/>
+        </w:rPr>
+        <w:t>Costos y rentabilidad por cliente, contrato y orden de servicio</w:t>
+      </w:r>
+    </w:p>
+    <w:p>
+      <w:pPr>
+        <w:pStyle w:val="ListParagraph"/>
+        <w:numPr>
+          <w:ilvl w:val="0"/>
+          <w:numId w:val="5"/>
+        </w:numPr>
+        <w:spacing w:after="70" w:line="276"/>
+      </w:pPr>
+      <w:r>
+        <w:rPr>
+          <w:rFonts w:ascii="Arial" w:cs="Arial" w:eastAsia="Arial" w:hAnsi="Arial"/>
+          <w:color w:val="475569"/>
+          <w:sz w:val="20"/>
+          <w:szCs w:val="20"/>
+        </w:rPr>
+        <w:t>Centro de notificaciones con escalamiento</w:t>
       </w:r>
     </w:p>
     <w:p>
@@ -4043,7 +4998,7 @@
           <w:sz w:val="20"/>
           <w:szCs w:val="20"/>
         </w:rPr>
-        <w:t xml:space="preserve">Correo y WhatsApp automatizados</w:t>
+        <w:t>Analítica comercial de prospectos y oportunidades</w:t>
       </w:r>
     </w:p>
     <w:p>
@@ -4062,7 +5017,7 @@
           <w:sz w:val="20"/>
           <w:szCs w:val="20"/>
         </w:rPr>
-        <w:t xml:space="preserve">Firma electrónica</w:t>
+        <w:t>Cliente 360 avanzado y portal de seguimiento</w:t>
       </w:r>
     </w:p>
     <w:p>
@@ -4081,7 +5036,83 @@
           <w:sz w:val="20"/>
           <w:szCs w:val="20"/>
         </w:rPr>
+        <w:t xml:space="preserve">Correo y WhatsApp automatizados</w:t>
+      </w:r>
+    </w:p>
+    <w:p>
+      <w:pPr>
+        <w:pStyle w:val="ListParagraph"/>
+        <w:numPr>
+          <w:ilvl w:val="0"/>
+          <w:numId w:val="6"/>
+        </w:numPr>
+        <w:spacing w:after="70" w:line="276"/>
+      </w:pPr>
+      <w:r>
+        <w:rPr>
+          <w:rFonts w:ascii="Arial" w:cs="Arial" w:eastAsia="Arial" w:hAnsi="Arial"/>
+          <w:color w:val="475569"/>
+          <w:sz w:val="20"/>
+          <w:szCs w:val="20"/>
+        </w:rPr>
+        <w:t xml:space="preserve">Firma electrónica</w:t>
+      </w:r>
+    </w:p>
+    <w:p>
+      <w:pPr>
+        <w:pStyle w:val="ListParagraph"/>
+        <w:numPr>
+          <w:ilvl w:val="0"/>
+          <w:numId w:val="6"/>
+        </w:numPr>
+        <w:spacing w:after="70" w:line="276"/>
+      </w:pPr>
+      <w:r>
+        <w:rPr>
+          <w:rFonts w:ascii="Arial" w:cs="Arial" w:eastAsia="Arial" w:hAnsi="Arial"/>
+          <w:color w:val="475569"/>
+          <w:sz w:val="20"/>
+          <w:szCs w:val="20"/>
+        </w:rPr>
         <w:t xml:space="preserve">OCR y validación documental</w:t>
+      </w:r>
+    </w:p>
+    <w:p>
+      <w:pPr>
+        <w:pStyle w:val="ListParagraph"/>
+        <w:numPr>
+          <w:ilvl w:val="0"/>
+          <w:numId w:val="6"/>
+        </w:numPr>
+        <w:spacing w:after="70" w:line="276"/>
+      </w:pPr>
+      <w:r>
+        <w:rPr>
+          <w:rFonts w:ascii="Arial" w:cs="Arial" w:eastAsia="Arial" w:hAnsi="Arial"/>
+          <w:color w:val="475569"/>
+          <w:sz w:val="20"/>
+          <w:szCs w:val="20"/>
+        </w:rPr>
+        <w:t>Auditoría documental inteligente</w:t>
+      </w:r>
+    </w:p>
+    <w:p>
+      <w:pPr>
+        <w:pStyle w:val="ListParagraph"/>
+        <w:numPr>
+          <w:ilvl w:val="0"/>
+          <w:numId w:val="6"/>
+        </w:numPr>
+        <w:spacing w:after="70" w:line="276"/>
+      </w:pPr>
+      <w:r>
+        <w:rPr>
+          <w:rFonts w:ascii="Arial" w:cs="Arial" w:eastAsia="Arial" w:hAnsi="Arial"/>
+          <w:color w:val="475569"/>
+          <w:sz w:val="20"/>
+          <w:szCs w:val="20"/>
+        </w:rPr>
+        <w:t>Gobernanza avanzada, conservación y trazabilidad</w:t>
       </w:r>
     </w:p>
     <w:p>
@@ -6099,6 +7130,44 @@
           <w:szCs w:val="20"/>
         </w:rPr>
         <w:t xml:space="preserve">Oferta comercial de cuatro planes: Esencial, Gestión, Operaciones e Integral.</w:t>
+      </w:r>
+    </w:p>
+    <w:p>
+      <w:pPr>
+        <w:pStyle w:val="ListParagraph"/>
+        <w:numPr>
+          <w:ilvl w:val="0"/>
+          <w:numId w:val="8"/>
+        </w:numPr>
+        <w:spacing w:after="70" w:line="276"/>
+      </w:pPr>
+      <w:r>
+        <w:rPr>
+          <w:rFonts w:ascii="Arial" w:cs="Arial" w:eastAsia="Arial" w:hAnsi="Arial"/>
+          <w:color w:val="475569"/>
+          <w:sz w:val="20"/>
+          <w:szCs w:val="20"/>
+        </w:rPr>
+        <w:t>Prospectos y oportunidades incluidos desde el Plan Gestión.</w:t>
+      </w:r>
+    </w:p>
+    <w:p>
+      <w:pPr>
+        <w:pStyle w:val="ListParagraph"/>
+        <w:numPr>
+          <w:ilvl w:val="0"/>
+          <w:numId w:val="8"/>
+        </w:numPr>
+        <w:spacing w:after="70" w:line="276"/>
+      </w:pPr>
+      <w:r>
+        <w:rPr>
+          <w:rFonts w:ascii="Arial" w:cs="Arial" w:eastAsia="Arial" w:hAnsi="Arial"/>
+          <w:color w:val="475569"/>
+          <w:sz w:val="20"/>
+          <w:szCs w:val="20"/>
+        </w:rPr>
+        <w:t>Incidentes, acciones correctivas, costos y rentabilidad incluidos desde el Plan Operaciones.</w:t>
       </w:r>
     </w:p>
     <w:p>

</xml_diff>